<commit_message>
docs: add repository url to formulation document
</commit_message>
<xml_diff>
--- a/docs/EcoPlato-Formulacion.docx
+++ b/docs/EcoPlato-Formulacion.docx
@@ -79,12 +79,6 @@
         <w:gridCol w:w="6960"/>
       </w:tblGrid>
       <w:tr>
-        <w:tblPrEx>
-          <w:tblCellMar>
-            <w:top w:w="0" w:type="dxa"/>
-            <w:bottom w:w="0" w:type="dxa"/>
-          </w:tblCellMar>
-        </w:tblPrEx>
         <w:trPr>
           <w:tblHeader/>
         </w:trPr>
@@ -146,12 +140,6 @@
         </w:tc>
       </w:tr>
       <w:tr>
-        <w:tblPrEx>
-          <w:tblCellMar>
-            <w:top w:w="0" w:type="dxa"/>
-            <w:bottom w:w="0" w:type="dxa"/>
-          </w:tblCellMar>
-        </w:tblPrEx>
         <w:tc>
           <w:tcPr>
             <w:tcW w:w="2400" w:type="dxa"/>
@@ -204,12 +192,6 @@
         </w:tc>
       </w:tr>
       <w:tr>
-        <w:tblPrEx>
-          <w:tblCellMar>
-            <w:top w:w="0" w:type="dxa"/>
-            <w:bottom w:w="0" w:type="dxa"/>
-          </w:tblCellMar>
-        </w:tblPrEx>
         <w:tc>
           <w:tcPr>
             <w:tcW w:w="2400" w:type="dxa"/>
@@ -275,12 +257,6 @@
         </w:tc>
       </w:tr>
       <w:tr>
-        <w:tblPrEx>
-          <w:tblCellMar>
-            <w:top w:w="0" w:type="dxa"/>
-            <w:bottom w:w="0" w:type="dxa"/>
-          </w:tblCellMar>
-        </w:tblPrEx>
         <w:tc>
           <w:tcPr>
             <w:tcW w:w="2400" w:type="dxa"/>
@@ -333,12 +309,6 @@
         </w:tc>
       </w:tr>
       <w:tr>
-        <w:tblPrEx>
-          <w:tblCellMar>
-            <w:top w:w="0" w:type="dxa"/>
-            <w:bottom w:w="0" w:type="dxa"/>
-          </w:tblCellMar>
-        </w:tblPrEx>
         <w:tc>
           <w:tcPr>
             <w:tcW w:w="2400" w:type="dxa"/>
@@ -393,12 +363,6 @@
         </w:tc>
       </w:tr>
       <w:tr>
-        <w:tblPrEx>
-          <w:tblCellMar>
-            <w:top w:w="0" w:type="dxa"/>
-            <w:bottom w:w="0" w:type="dxa"/>
-          </w:tblCellMar>
-        </w:tblPrEx>
         <w:tc>
           <w:tcPr>
             <w:tcW w:w="2400" w:type="dxa"/>
@@ -451,12 +415,6 @@
         </w:tc>
       </w:tr>
       <w:tr>
-        <w:tblPrEx>
-          <w:tblCellMar>
-            <w:top w:w="0" w:type="dxa"/>
-            <w:bottom w:w="0" w:type="dxa"/>
-          </w:tblCellMar>
-        </w:tblPrEx>
         <w:tc>
           <w:tcPr>
             <w:tcW w:w="2400" w:type="dxa"/>
@@ -533,12 +491,6 @@
         </w:tc>
       </w:tr>
       <w:tr>
-        <w:tblPrEx>
-          <w:tblCellMar>
-            <w:top w:w="0" w:type="dxa"/>
-            <w:bottom w:w="0" w:type="dxa"/>
-          </w:tblCellMar>
-        </w:tblPrEx>
         <w:tc>
           <w:tcPr>
             <w:tcW w:w="2400" w:type="dxa"/>
@@ -591,12 +543,6 @@
         </w:tc>
       </w:tr>
       <w:tr>
-        <w:tblPrEx>
-          <w:tblCellMar>
-            <w:top w:w="0" w:type="dxa"/>
-            <w:bottom w:w="0" w:type="dxa"/>
-          </w:tblCellMar>
-        </w:tblPrEx>
         <w:tc>
           <w:tcPr>
             <w:tcW w:w="2400" w:type="dxa"/>
@@ -705,12 +651,6 @@
         <w:gridCol w:w="3600"/>
       </w:tblGrid>
       <w:tr>
-        <w:tblPrEx>
-          <w:tblCellMar>
-            <w:top w:w="0" w:type="dxa"/>
-            <w:bottom w:w="0" w:type="dxa"/>
-          </w:tblCellMar>
-        </w:tblPrEx>
         <w:trPr>
           <w:tblHeader/>
         </w:trPr>
@@ -800,12 +740,6 @@
         </w:tc>
       </w:tr>
       <w:tr>
-        <w:tblPrEx>
-          <w:tblCellMar>
-            <w:top w:w="0" w:type="dxa"/>
-            <w:bottom w:w="0" w:type="dxa"/>
-          </w:tblCellMar>
-        </w:tblPrEx>
         <w:tc>
           <w:tcPr>
             <w:tcW w:w="600" w:type="dxa"/>
@@ -877,18 +811,12 @@
                 <w:sz w:val="19"/>
                 <w:szCs w:val="19"/>
               </w:rPr>
-              <w:t>1.037.608.335</w:t>
+              <w:t>1037608335</w:t>
             </w:r>
           </w:p>
         </w:tc>
       </w:tr>
       <w:tr>
-        <w:tblPrEx>
-          <w:tblCellMar>
-            <w:top w:w="0" w:type="dxa"/>
-            <w:bottom w:w="0" w:type="dxa"/>
-          </w:tblCellMar>
-        </w:tblPrEx>
         <w:tc>
           <w:tcPr>
             <w:tcW w:w="600" w:type="dxa"/>
@@ -974,18 +902,12 @@
                 <w:sz w:val="19"/>
                 <w:szCs w:val="19"/>
               </w:rPr>
-              <w:t>1.214.723.776</w:t>
+              <w:t>1214723776</w:t>
             </w:r>
           </w:p>
         </w:tc>
       </w:tr>
       <w:tr>
-        <w:tblPrEx>
-          <w:tblCellMar>
-            <w:top w:w="0" w:type="dxa"/>
-            <w:bottom w:w="0" w:type="dxa"/>
-          </w:tblCellMar>
-        </w:tblPrEx>
         <w:tc>
           <w:tcPr>
             <w:tcW w:w="600" w:type="dxa"/>
@@ -1057,18 +979,12 @@
                 <w:sz w:val="19"/>
                 <w:szCs w:val="19"/>
               </w:rPr>
-              <w:t>1.001.032.321</w:t>
+              <w:t>1001032321</w:t>
             </w:r>
           </w:p>
         </w:tc>
       </w:tr>
       <w:tr>
-        <w:tblPrEx>
-          <w:tblCellMar>
-            <w:top w:w="0" w:type="dxa"/>
-            <w:bottom w:w="0" w:type="dxa"/>
-          </w:tblCellMar>
-        </w:tblPrEx>
         <w:tc>
           <w:tcPr>
             <w:tcW w:w="600" w:type="dxa"/>
@@ -1143,7 +1059,7 @@
                 <w:sz w:val="19"/>
                 <w:szCs w:val="19"/>
               </w:rPr>
-              <w:t>15.371.198</w:t>
+              <w:t>15371198</w:t>
             </w:r>
           </w:p>
         </w:tc>
@@ -1205,23 +1121,7 @@
           <w:sz w:val="22"/>
           <w:szCs w:val="22"/>
         </w:rPr>
-        <w:t>Los restaurantes generan excedentes de alimentos aptos para el consumo humano de fo</w:t>
-      </w:r>
-      <w:r>
-        <w:rPr>
-          <w:rFonts w:ascii="Calibri" w:eastAsia="Calibri" w:hAnsi="Calibri" w:cs="Calibri"/>
-          <w:sz w:val="22"/>
-          <w:szCs w:val="22"/>
-        </w:rPr>
-        <w:t xml:space="preserve">rma recurrente y predecible. Sin embargo, los gestionan de manera reactiva y tardía: cuando el excedente ya existe, la ventana de aprovechamiento se reduce a pocas horas y la coordinación con comedores comunitarios depende de llamadas, mensajes informales </w:t>
-      </w:r>
-      <w:r>
-        <w:rPr>
-          <w:rFonts w:ascii="Calibri" w:eastAsia="Calibri" w:hAnsi="Calibri" w:cs="Calibri"/>
-          <w:sz w:val="22"/>
-          <w:szCs w:val="22"/>
-        </w:rPr>
-        <w:t>y disponibilidad fortuita.</w:t>
+        <w:t>Los restaurantes generan excedentes de alimentos aptos para el consumo humano de forma recurrente y predecible. Sin embargo, los gestionan de manera reactiva y tardía: cuando el excedente ya existe, la ventana de aprovechamiento se reduce a pocas horas y la coordinación con comedores comunitarios depende de llamadas, mensajes informales y disponibilidad fortuita.</w:t>
       </w:r>
     </w:p>
     <w:p>
@@ -1251,17 +1151,7 @@
           <w:sz w:val="22"/>
           <w:szCs w:val="22"/>
         </w:rPr>
-        <w:t>El problema no es la ausencia de un</w:t>
-      </w:r>
-      <w:r>
-        <w:rPr>
-          <w:rFonts w:ascii="Calibri" w:eastAsia="Calibri" w:hAnsi="Calibri" w:cs="Calibri"/>
-          <w:b/>
-          <w:bCs/>
-          <w:sz w:val="22"/>
-          <w:szCs w:val="22"/>
-        </w:rPr>
-        <w:t xml:space="preserve"> canal de comunicación. Los canales existen. El problema es que todos operan después de que el excedente ya ocurrió.</w:t>
+        <w:t>El problema no es la ausencia de un canal de comunicación. Los canales existen. El problema es que todos operan después de que el excedente ya ocurrió.</w:t>
       </w:r>
     </w:p>
     <w:p>
@@ -1317,15 +1207,7 @@
           <w:sz w:val="22"/>
           <w:szCs w:val="22"/>
         </w:rPr>
-        <w:t>Desarrollar una plataforma web que anticipe y asigne excedentes alimentarios de restaurantes hacia comedores</w:t>
-      </w:r>
-      <w:r>
-        <w:rPr>
-          <w:rFonts w:ascii="Calibri" w:eastAsia="Calibri" w:hAnsi="Calibri" w:cs="Calibri"/>
-          <w:sz w:val="22"/>
-          <w:szCs w:val="22"/>
-        </w:rPr>
-        <w:t xml:space="preserve"> comunitarios, reduciendo el desperdicio de alimentos y permitiendo a los receptores planear su operación con antelación.</w:t>
+        <w:t>Desarrollar una plataforma web que anticipe y asigne excedentes alimentarios de restaurantes hacia comedores comunitarios, reduciendo el desperdicio de alimentos y permitiendo a los receptores planear su operación con antelación.</w:t>
       </w:r>
     </w:p>
     <w:p>
@@ -1418,15 +1300,7 @@
           <w:szCs w:val="22"/>
         </w:rPr>
         <w:lastRenderedPageBreak/>
-        <w:t>Construir un panel</w:t>
-      </w:r>
-      <w:r>
-        <w:rPr>
-          <w:rFonts w:ascii="Calibri" w:eastAsia="Calibri" w:hAnsi="Calibri" w:cs="Calibri"/>
-          <w:sz w:val="22"/>
-          <w:szCs w:val="22"/>
-        </w:rPr>
-        <w:t xml:space="preserve"> de indicadores que mida el impacto real de la operación, incluyendo sus fallos.</w:t>
+        <w:t>Construir un panel de indicadores que mida el impacto real de la operación, incluyendo sus fallos.</w:t>
       </w:r>
     </w:p>
     <w:p>
@@ -1481,18 +1355,7 @@
           <w:sz w:val="30"/>
           <w:szCs w:val="30"/>
         </w:rPr>
-        <w:t>3. Aná</w:t>
-      </w:r>
-      <w:r>
-        <w:rPr>
-          <w:rFonts w:ascii="Calibri" w:eastAsia="Calibri" w:hAnsi="Calibri" w:cs="Calibri"/>
-          <w:b/>
-          <w:bCs/>
-          <w:color w:val="2E7D32"/>
-          <w:sz w:val="30"/>
-          <w:szCs w:val="30"/>
-        </w:rPr>
-        <w:t>lisis de soluciones existentes</w:t>
+        <w:t>3. Análisis de soluciones existentes</w:t>
       </w:r>
     </w:p>
     <w:p>
@@ -1541,12 +1404,6 @@
         <w:gridCol w:w="3280"/>
       </w:tblGrid>
       <w:tr>
-        <w:tblPrEx>
-          <w:tblCellMar>
-            <w:top w:w="0" w:type="dxa"/>
-            <w:bottom w:w="0" w:type="dxa"/>
-          </w:tblCellMar>
-        </w:tblPrEx>
         <w:trPr>
           <w:tblHeader/>
         </w:trPr>
@@ -1664,12 +1521,6 @@
         </w:tc>
       </w:tr>
       <w:tr>
-        <w:tblPrEx>
-          <w:tblCellMar>
-            <w:top w:w="0" w:type="dxa"/>
-            <w:bottom w:w="0" w:type="dxa"/>
-          </w:tblCellMar>
-        </w:tblPrEx>
         <w:tc>
           <w:tcPr>
             <w:tcW w:w="1900" w:type="dxa"/>
@@ -1814,12 +1665,6 @@
         </w:tc>
       </w:tr>
       <w:tr>
-        <w:tblPrEx>
-          <w:tblCellMar>
-            <w:top w:w="0" w:type="dxa"/>
-            <w:bottom w:w="0" w:type="dxa"/>
-          </w:tblCellMar>
-        </w:tblPrEx>
         <w:tc>
           <w:tcPr>
             <w:tcW w:w="1900" w:type="dxa"/>
@@ -1926,12 +1771,6 @@
         </w:tc>
       </w:tr>
       <w:tr>
-        <w:tblPrEx>
-          <w:tblCellMar>
-            <w:top w:w="0" w:type="dxa"/>
-            <w:bottom w:w="0" w:type="dxa"/>
-          </w:tblCellMar>
-        </w:tblPrEx>
         <w:tc>
           <w:tcPr>
             <w:tcW w:w="1900" w:type="dxa"/>
@@ -2036,12 +1875,6 @@
         </w:tc>
       </w:tr>
       <w:tr>
-        <w:tblPrEx>
-          <w:tblCellMar>
-            <w:top w:w="0" w:type="dxa"/>
-            <w:bottom w:w="0" w:type="dxa"/>
-          </w:tblCellMar>
-        </w:tblPrEx>
         <w:tc>
           <w:tcPr>
             <w:tcW w:w="1900" w:type="dxa"/>
@@ -2228,17 +2061,7 @@
           <w:sz w:val="22"/>
           <w:szCs w:val="22"/>
         </w:rPr>
-        <w:t xml:space="preserve"> únicamente como un canal de comunicación no constituiría un aporte difere</w:t>
-      </w:r>
-      <w:r>
-        <w:rPr>
-          <w:rFonts w:ascii="Calibri" w:eastAsia="Calibri" w:hAnsi="Calibri" w:cs="Calibri"/>
-          <w:b/>
-          <w:bCs/>
-          <w:sz w:val="22"/>
-          <w:szCs w:val="22"/>
-        </w:rPr>
-        <w:t>ncial.</w:t>
+        <w:t xml:space="preserve"> únicamente como un canal de comunicación no constituiría un aporte diferencial.</w:t>
       </w:r>
     </w:p>
     <w:p>
@@ -2283,15 +2106,7 @@
           <w:sz w:val="22"/>
           <w:szCs w:val="22"/>
         </w:rPr>
-        <w:t>Todas las soluciones revisadas son reactivas. El excedente se publica cuando ya ocurrió, y a partir de ese momento corre</w:t>
-      </w:r>
-      <w:r>
-        <w:rPr>
-          <w:rFonts w:ascii="Calibri" w:eastAsia="Calibri" w:hAnsi="Calibri" w:cs="Calibri"/>
-          <w:sz w:val="22"/>
-          <w:szCs w:val="22"/>
-        </w:rPr>
-        <w:t xml:space="preserve"> un reloj de </w:t>
+        <w:t xml:space="preserve">Todas las soluciones revisadas son reactivas. El excedente se publica cuando ya ocurrió, y a partir de ese momento corre un reloj de </w:t>
       </w:r>
       <w:proofErr w:type="spellStart"/>
       <w:r>
@@ -2372,15 +2187,7 @@
           <w:sz w:val="22"/>
           <w:szCs w:val="22"/>
         </w:rPr>
-        <w:t xml:space="preserve"> se posiciona como un motor de anticipación y </w:t>
-      </w:r>
-      <w:r>
-        <w:rPr>
-          <w:rFonts w:ascii="Calibri" w:eastAsia="Calibri" w:hAnsi="Calibri" w:cs="Calibri"/>
-          <w:sz w:val="22"/>
-          <w:szCs w:val="22"/>
-        </w:rPr>
-        <w:t>asignación, no como un tablón de anuncios de excedentes.</w:t>
+        <w:t xml:space="preserve"> se posiciona como un motor de anticipación y asignación, no como un tablón de anuncios de excedentes.</w:t>
       </w:r>
     </w:p>
     <w:p>
@@ -2427,17 +2234,7 @@
           <w:sz w:val="22"/>
           <w:szCs w:val="22"/>
         </w:rPr>
-        <w:t>Valor: el comedor comunitario planea su menú con ante</w:t>
-      </w:r>
-      <w:r>
-        <w:rPr>
-          <w:rFonts w:ascii="Calibri" w:eastAsia="Calibri" w:hAnsi="Calibri" w:cs="Calibri"/>
-          <w:b/>
-          <w:bCs/>
-          <w:sz w:val="22"/>
-          <w:szCs w:val="22"/>
-        </w:rPr>
-        <w:t>lación en lugar de improvisar sobre lo que aparezca.</w:t>
+        <w:t>Valor: el comedor comunitario planea su menú con antelación en lugar de improvisar sobre lo que aparezca.</w:t>
       </w:r>
     </w:p>
     <w:p>
@@ -2544,12 +2341,6 @@
         <w:gridCol w:w="5960"/>
       </w:tblGrid>
       <w:tr>
-        <w:tblPrEx>
-          <w:tblCellMar>
-            <w:top w:w="0" w:type="dxa"/>
-            <w:bottom w:w="0" w:type="dxa"/>
-          </w:tblCellMar>
-        </w:tblPrEx>
         <w:trPr>
           <w:tblHeader/>
         </w:trPr>
@@ -2611,12 +2402,6 @@
         </w:tc>
       </w:tr>
       <w:tr>
-        <w:tblPrEx>
-          <w:tblCellMar>
-            <w:top w:w="0" w:type="dxa"/>
-            <w:bottom w:w="0" w:type="dxa"/>
-          </w:tblCellMar>
-        </w:tblPrEx>
         <w:tc>
           <w:tcPr>
             <w:tcW w:w="3400" w:type="dxa"/>
@@ -2669,12 +2454,6 @@
         </w:tc>
       </w:tr>
       <w:tr>
-        <w:tblPrEx>
-          <w:tblCellMar>
-            <w:top w:w="0" w:type="dxa"/>
-            <w:bottom w:w="0" w:type="dxa"/>
-          </w:tblCellMar>
-        </w:tblPrEx>
         <w:tc>
           <w:tcPr>
             <w:tcW w:w="3400" w:type="dxa"/>
@@ -2729,12 +2508,6 @@
         </w:tc>
       </w:tr>
       <w:tr>
-        <w:tblPrEx>
-          <w:tblCellMar>
-            <w:top w:w="0" w:type="dxa"/>
-            <w:bottom w:w="0" w:type="dxa"/>
-          </w:tblCellMar>
-        </w:tblPrEx>
         <w:tc>
           <w:tcPr>
             <w:tcW w:w="3400" w:type="dxa"/>
@@ -2787,12 +2560,6 @@
         </w:tc>
       </w:tr>
       <w:tr>
-        <w:tblPrEx>
-          <w:tblCellMar>
-            <w:top w:w="0" w:type="dxa"/>
-            <w:bottom w:w="0" w:type="dxa"/>
-          </w:tblCellMar>
-        </w:tblPrEx>
         <w:tc>
           <w:tcPr>
             <w:tcW w:w="3400" w:type="dxa"/>
@@ -2847,12 +2614,6 @@
         </w:tc>
       </w:tr>
       <w:tr>
-        <w:tblPrEx>
-          <w:tblCellMar>
-            <w:top w:w="0" w:type="dxa"/>
-            <w:bottom w:w="0" w:type="dxa"/>
-          </w:tblCellMar>
-        </w:tblPrEx>
         <w:tc>
           <w:tcPr>
             <w:tcW w:w="3400" w:type="dxa"/>
@@ -2957,8 +2718,9 @@
           <w:sz w:val="26"/>
           <w:szCs w:val="26"/>
         </w:rPr>
-        <w:t>EcoPla</w:t>
-      </w:r>
+        <w:t>EcoPlato</w:t>
+      </w:r>
+      <w:proofErr w:type="spellEnd"/>
       <w:r>
         <w:rPr>
           <w:rFonts w:ascii="Calibri" w:eastAsia="Calibri" w:hAnsi="Calibri" w:cs="Calibri"/>
@@ -2968,18 +2730,6 @@
           <w:sz w:val="26"/>
           <w:szCs w:val="26"/>
         </w:rPr>
-        <w:t>to</w:t>
-      </w:r>
-      <w:proofErr w:type="spellEnd"/>
-      <w:r>
-        <w:rPr>
-          <w:rFonts w:ascii="Calibri" w:eastAsia="Calibri" w:hAnsi="Calibri" w:cs="Calibri"/>
-          <w:b/>
-          <w:bCs/>
-          <w:color w:val="2E7D32"/>
-          <w:sz w:val="26"/>
-          <w:szCs w:val="26"/>
-        </w:rPr>
         <w:t xml:space="preserve"> no publica excedentes: los anticipa y los asigna.</w:t>
       </w:r>
     </w:p>
@@ -3019,15 +2769,7 @@
           <w:sz w:val="22"/>
           <w:szCs w:val="22"/>
         </w:rPr>
-        <w:t>El proyecto se construye con las tecnologías que el programa enseña, en el orden en que las enseña. Esta restricción es deliberada y garantiza la viabilidad de cada entreg</w:t>
-      </w:r>
-      <w:r>
-        <w:rPr>
-          <w:rFonts w:ascii="Calibri" w:eastAsia="Calibri" w:hAnsi="Calibri" w:cs="Calibri"/>
-          <w:sz w:val="22"/>
-          <w:szCs w:val="22"/>
-        </w:rPr>
-        <w:t>a.</w:t>
+        <w:t>El proyecto se construye con las tecnologías que el programa enseña, en el orden en que las enseña. Esta restricción es deliberada y garantiza la viabilidad de cada entrega.</w:t>
       </w:r>
     </w:p>
     <w:tbl>
@@ -3053,12 +2795,6 @@
         <w:gridCol w:w="5560"/>
       </w:tblGrid>
       <w:tr>
-        <w:tblPrEx>
-          <w:tblCellMar>
-            <w:top w:w="0" w:type="dxa"/>
-            <w:bottom w:w="0" w:type="dxa"/>
-          </w:tblCellMar>
-        </w:tblPrEx>
         <w:trPr>
           <w:tblHeader/>
         </w:trPr>
@@ -3148,12 +2884,6 @@
         </w:tc>
       </w:tr>
       <w:tr>
-        <w:tblPrEx>
-          <w:tblCellMar>
-            <w:top w:w="0" w:type="dxa"/>
-            <w:bottom w:w="0" w:type="dxa"/>
-          </w:tblCellMar>
-        </w:tblPrEx>
         <w:tc>
           <w:tcPr>
             <w:tcW w:w="1100" w:type="dxa"/>
@@ -3231,12 +2961,6 @@
         </w:tc>
       </w:tr>
       <w:tr>
-        <w:tblPrEx>
-          <w:tblCellMar>
-            <w:top w:w="0" w:type="dxa"/>
-            <w:bottom w:w="0" w:type="dxa"/>
-          </w:tblCellMar>
-        </w:tblPrEx>
         <w:tc>
           <w:tcPr>
             <w:tcW w:w="1100" w:type="dxa"/>
@@ -3338,12 +3062,6 @@
         </w:tc>
       </w:tr>
       <w:tr>
-        <w:tblPrEx>
-          <w:tblCellMar>
-            <w:top w:w="0" w:type="dxa"/>
-            <w:bottom w:w="0" w:type="dxa"/>
-          </w:tblCellMar>
-        </w:tblPrEx>
         <w:tc>
           <w:tcPr>
             <w:tcW w:w="1100" w:type="dxa"/>
@@ -3533,12 +3251,6 @@
         <w:gridCol w:w="5260"/>
       </w:tblGrid>
       <w:tr>
-        <w:tblPrEx>
-          <w:tblCellMar>
-            <w:top w:w="0" w:type="dxa"/>
-            <w:bottom w:w="0" w:type="dxa"/>
-          </w:tblCellMar>
-        </w:tblPrEx>
         <w:trPr>
           <w:tblHeader/>
         </w:trPr>
@@ -3628,12 +3340,6 @@
         </w:tc>
       </w:tr>
       <w:tr>
-        <w:tblPrEx>
-          <w:tblCellMar>
-            <w:top w:w="0" w:type="dxa"/>
-            <w:bottom w:w="0" w:type="dxa"/>
-          </w:tblCellMar>
-        </w:tblPrEx>
         <w:tc>
           <w:tcPr>
             <w:tcW w:w="2600" w:type="dxa"/>
@@ -3711,12 +3417,6 @@
         </w:tc>
       </w:tr>
       <w:tr>
-        <w:tblPrEx>
-          <w:tblCellMar>
-            <w:top w:w="0" w:type="dxa"/>
-            <w:bottom w:w="0" w:type="dxa"/>
-          </w:tblCellMar>
-        </w:tblPrEx>
         <w:tc>
           <w:tcPr>
             <w:tcW w:w="2600" w:type="dxa"/>
@@ -3797,12 +3497,6 @@
         </w:tc>
       </w:tr>
       <w:tr>
-        <w:tblPrEx>
-          <w:tblCellMar>
-            <w:top w:w="0" w:type="dxa"/>
-            <w:bottom w:w="0" w:type="dxa"/>
-          </w:tblCellMar>
-        </w:tblPrEx>
         <w:tc>
           <w:tcPr>
             <w:tcW w:w="2600" w:type="dxa"/>
@@ -3911,15 +3605,7 @@
           <w:sz w:val="22"/>
           <w:szCs w:val="22"/>
         </w:rPr>
-        <w:t>Visión: ser la plataforma de referencia en ge</w:t>
-      </w:r>
-      <w:r>
-        <w:rPr>
-          <w:rFonts w:ascii="Calibri" w:eastAsia="Calibri" w:hAnsi="Calibri" w:cs="Calibri"/>
-          <w:sz w:val="22"/>
-          <w:szCs w:val="22"/>
-        </w:rPr>
-        <w:t>stión anticipada de redistribución de alimentos en Colombia hacia el año 2030.</w:t>
+        <w:t>Visión: ser la plataforma de referencia en gestión anticipada de redistribución de alimentos en Colombia hacia el año 2030.</w:t>
       </w:r>
     </w:p>
     <w:p>
@@ -3950,18 +3636,7 @@
           <w:sz w:val="30"/>
           <w:szCs w:val="30"/>
         </w:rPr>
-        <w:t>7. M</w:t>
-      </w:r>
-      <w:r>
-        <w:rPr>
-          <w:rFonts w:ascii="Calibri" w:eastAsia="Calibri" w:hAnsi="Calibri" w:cs="Calibri"/>
-          <w:b/>
-          <w:bCs/>
-          <w:color w:val="2E7D32"/>
-          <w:sz w:val="30"/>
-          <w:szCs w:val="30"/>
-        </w:rPr>
-        <w:t>etodología de trabajo del equipo</w:t>
+        <w:t>7. Metodología de trabajo del equipo</w:t>
       </w:r>
     </w:p>
     <w:p>
@@ -3983,15 +3658,7 @@
           <w:sz w:val="22"/>
           <w:szCs w:val="22"/>
         </w:rPr>
-        <w:t>El equipo adopta un esquema de trabajo colaborativo, con el desarrollo distribuido por componentes y control de versiones centralizado en un repositorio público de GitHub. Cada integrante asume un componente completo y tra</w:t>
-      </w:r>
-      <w:r>
-        <w:rPr>
-          <w:rFonts w:ascii="Calibri" w:eastAsia="Calibri" w:hAnsi="Calibri" w:cs="Calibri"/>
-          <w:sz w:val="22"/>
-          <w:szCs w:val="22"/>
-        </w:rPr>
-        <w:t>baja sobre archivos independientes, lo que minimiza los conflictos de integración y permite que todos registren avances de forma paralela.</w:t>
+        <w:t>El equipo adopta un esquema de trabajo colaborativo, con el desarrollo distribuido por componentes y control de versiones centralizado en un repositorio público de GitHub. Cada integrante asume un componente completo y trabaja sobre archivos independientes, lo que minimiza los conflictos de integración y permite que todos registren avances de forma paralela.</w:t>
       </w:r>
     </w:p>
     <w:tbl>
@@ -4016,12 +3683,6 @@
         <w:gridCol w:w="6160"/>
       </w:tblGrid>
       <w:tr>
-        <w:tblPrEx>
-          <w:tblCellMar>
-            <w:top w:w="0" w:type="dxa"/>
-            <w:bottom w:w="0" w:type="dxa"/>
-          </w:tblCellMar>
-        </w:tblPrEx>
         <w:trPr>
           <w:tblHeader/>
         </w:trPr>
@@ -4083,12 +3744,6 @@
         </w:tc>
       </w:tr>
       <w:tr>
-        <w:tblPrEx>
-          <w:tblCellMar>
-            <w:top w:w="0" w:type="dxa"/>
-            <w:bottom w:w="0" w:type="dxa"/>
-          </w:tblCellMar>
-        </w:tblPrEx>
         <w:tc>
           <w:tcPr>
             <w:tcW w:w="3200" w:type="dxa"/>
@@ -4141,12 +3796,6 @@
         </w:tc>
       </w:tr>
       <w:tr>
-        <w:tblPrEx>
-          <w:tblCellMar>
-            <w:top w:w="0" w:type="dxa"/>
-            <w:bottom w:w="0" w:type="dxa"/>
-          </w:tblCellMar>
-        </w:tblPrEx>
         <w:tc>
           <w:tcPr>
             <w:tcW w:w="3200" w:type="dxa"/>
@@ -4201,12 +3850,6 @@
         </w:tc>
       </w:tr>
       <w:tr>
-        <w:tblPrEx>
-          <w:tblCellMar>
-            <w:top w:w="0" w:type="dxa"/>
-            <w:bottom w:w="0" w:type="dxa"/>
-          </w:tblCellMar>
-        </w:tblPrEx>
         <w:tc>
           <w:tcPr>
             <w:tcW w:w="3200" w:type="dxa"/>
@@ -4260,12 +3903,6 @@
         </w:tc>
       </w:tr>
       <w:tr>
-        <w:tblPrEx>
-          <w:tblCellMar>
-            <w:top w:w="0" w:type="dxa"/>
-            <w:bottom w:w="0" w:type="dxa"/>
-          </w:tblCellMar>
-        </w:tblPrEx>
         <w:tc>
           <w:tcPr>
             <w:tcW w:w="3200" w:type="dxa"/>
@@ -4417,15 +4054,7 @@
           <w:sz w:val="22"/>
           <w:szCs w:val="22"/>
         </w:rPr>
-        <w:t>El estándar de estructura sem</w:t>
-      </w:r>
-      <w:r>
-        <w:rPr>
-          <w:rFonts w:ascii="Calibri" w:eastAsia="Calibri" w:hAnsi="Calibri" w:cs="Calibri"/>
-          <w:sz w:val="22"/>
-          <w:szCs w:val="22"/>
-        </w:rPr>
-        <w:t>ántica se acuerda antes de empezar a construir y se aplica de forma uniforme.</w:t>
+        <w:t>El estándar de estructura semántica se acuerda antes de empezar a construir y se aplica de forma uniforme.</w:t>
       </w:r>
     </w:p>
     <w:p>
@@ -4463,15 +4092,7 @@
           <w:sz w:val="22"/>
           <w:szCs w:val="22"/>
         </w:rPr>
-        <w:t>El equipo comparte el aprendizaje de las herramientas: quien avanza primero en un tema apo</w:t>
-      </w:r>
-      <w:r>
-        <w:rPr>
-          <w:rFonts w:ascii="Calibri" w:eastAsia="Calibri" w:hAnsi="Calibri" w:cs="Calibri"/>
-          <w:sz w:val="22"/>
-          <w:szCs w:val="22"/>
-        </w:rPr>
-        <w:t>ya a los demás.</w:t>
+        <w:t>El equipo comparte el aprendizaje de las herramientas: quien avanza primero en un tema apoya a los demás.</w:t>
       </w:r>
     </w:p>
     <w:p>
@@ -4563,15 +4184,7 @@
           <w:sz w:val="22"/>
           <w:szCs w:val="22"/>
         </w:rPr>
-        <w:t xml:space="preserve"> se redactan en inglés y en modo imperativo, si</w:t>
-      </w:r>
-      <w:r>
-        <w:rPr>
-          <w:rFonts w:ascii="Calibri" w:eastAsia="Calibri" w:hAnsi="Calibri" w:cs="Calibri"/>
-          <w:sz w:val="22"/>
-          <w:szCs w:val="22"/>
-        </w:rPr>
-        <w:t>guiendo la convención profesional.</w:t>
+        <w:t xml:space="preserve"> se redactan en inglés y en modo imperativo, siguiendo la convención profesional.</w:t>
       </w:r>
     </w:p>
     <w:p>
@@ -4621,12 +4234,6 @@
         <w:gridCol w:w="6760"/>
       </w:tblGrid>
       <w:tr>
-        <w:tblPrEx>
-          <w:tblCellMar>
-            <w:top w:w="0" w:type="dxa"/>
-            <w:bottom w:w="0" w:type="dxa"/>
-          </w:tblCellMar>
-        </w:tblPrEx>
         <w:trPr>
           <w:tblHeader/>
         </w:trPr>
@@ -4688,12 +4295,6 @@
         </w:tc>
       </w:tr>
       <w:tr>
-        <w:tblPrEx>
-          <w:tblCellMar>
-            <w:top w:w="0" w:type="dxa"/>
-            <w:bottom w:w="0" w:type="dxa"/>
-          </w:tblCellMar>
-        </w:tblPrEx>
         <w:tc>
           <w:tcPr>
             <w:tcW w:w="2600" w:type="dxa"/>
@@ -4746,12 +4347,6 @@
         </w:tc>
       </w:tr>
       <w:tr>
-        <w:tblPrEx>
-          <w:tblCellMar>
-            <w:top w:w="0" w:type="dxa"/>
-            <w:bottom w:w="0" w:type="dxa"/>
-          </w:tblCellMar>
-        </w:tblPrEx>
         <w:tc>
           <w:tcPr>
             <w:tcW w:w="2600" w:type="dxa"/>
@@ -4806,12 +4401,6 @@
         </w:tc>
       </w:tr>
       <w:tr>
-        <w:tblPrEx>
-          <w:tblCellMar>
-            <w:top w:w="0" w:type="dxa"/>
-            <w:bottom w:w="0" w:type="dxa"/>
-          </w:tblCellMar>
-        </w:tblPrEx>
         <w:tc>
           <w:tcPr>
             <w:tcW w:w="2600" w:type="dxa"/>
@@ -4851,16 +4440,13 @@
             <w:pPr>
               <w:spacing w:line="250" w:lineRule="auto"/>
             </w:pPr>
+            <w:r>
+              <w:t>https://github.com/AndresJimenez198/ecoplato</w:t>
+            </w:r>
           </w:p>
         </w:tc>
       </w:tr>
       <w:tr>
-        <w:tblPrEx>
-          <w:tblCellMar>
-            <w:top w:w="0" w:type="dxa"/>
-            <w:bottom w:w="0" w:type="dxa"/>
-          </w:tblCellMar>
-        </w:tblPrEx>
         <w:tc>
           <w:tcPr>
             <w:tcW w:w="2600" w:type="dxa"/>
@@ -4911,6 +4497,8 @@
               </w:rPr>
               <w:t>4</w:t>
             </w:r>
+            <w:bookmarkStart w:id="0" w:name="_GoBack"/>
+            <w:bookmarkEnd w:id="0"/>
           </w:p>
         </w:tc>
       </w:tr>
@@ -5052,8 +4640,6 @@
         </w:rPr>
         <w:t xml:space="preserve"> — eatcloud.com, términos de uso y aviso de privacidad</w:t>
       </w:r>
-      <w:bookmarkStart w:id="0" w:name="_GoBack"/>
-      <w:bookmarkEnd w:id="0"/>
     </w:p>
     <w:p>
       <w:pPr>
@@ -5091,15 +4677,7 @@
           <w:sz w:val="22"/>
           <w:szCs w:val="22"/>
         </w:rPr>
-        <w:t>Banco de Alimentos de Bogotá</w:t>
-      </w:r>
-      <w:r>
-        <w:rPr>
-          <w:rFonts w:ascii="Calibri" w:eastAsia="Calibri" w:hAnsi="Calibri" w:cs="Calibri"/>
-          <w:sz w:val="22"/>
-          <w:szCs w:val="22"/>
-        </w:rPr>
-        <w:t xml:space="preserve"> — bancodealimentos.org.co</w:t>
+        <w:t>Banco de Alimentos de Bogotá — bancodealimentos.org.co</w:t>
       </w:r>
     </w:p>
     <w:sectPr>

</xml_diff>